<commit_message>
Corrige estatus energéticos de David Valdez, Wyndham y FACC (Cancún)
- David Valdez Romo (FAAG): corregido a dependiente del hotel (luz y agua)
- Wyndham Ambassador Monterrey Centro (MTYCW): 6 locales corregidos a
  dependientes del hotel (luz y agua)
- Amazon Tours y T.I. Experiencias (FACC): corregidos a dependientes por
  mutuo acuerdo y disposición contractual

Totales actualizados: 25 independientes (47.2%) / 28 dependientes (52.8%)
Donut locales actualizado de 74% a 42% independientes
</commit_message>
<xml_diff>
--- a/Diagnostico_Energeticos_2026_GVega.docx
+++ b/Diagnostico_Energeticos_2026_GVega.docx
@@ -218,7 +218,7 @@
                 <w:color w:val="FFFFFF"/>
                 <w:sz w:val="22"/>
               </w:rPr>
-              <w:t>35  (66.0%)</w:t>
+              <w:t>25  (47.2%)</w:t>
             </w:r>
           </w:p>
         </w:tc>
@@ -234,7 +234,7 @@
                 <w:color w:val="FFFFFF"/>
                 <w:sz w:val="22"/>
               </w:rPr>
-              <w:t>18  (34.0%)</w:t>
+              <w:t>28  (52.8%)</w:t>
             </w:r>
           </w:p>
         </w:tc>
@@ -1825,7 +1825,7 @@
       <w:r>
         <w:rPr>
           <w:b/>
-          <w:color w:val="1D6B4F"/>
+          <w:color w:val="B83232"/>
           <w:sz w:val="21"/>
         </w:rPr>
         <w:t>FAAG  ·  Fiesta Americana Aguascalientes</w:t>
@@ -1930,12 +1930,13 @@
         <w:tc>
           <w:tcPr>
             <w:tcW w:type="dxa" w:w="1881"/>
-            <w:shd w:val="clear" w:color="auto" w:fill="FFFFFF"/>
+            <w:shd w:val="clear" w:color="auto" w:fill="FDEAEA"/>
           </w:tcPr>
           <w:p>
             <w:r>
               <w:rPr>
                 <w:b w:val="0"/>
+                <w:color w:val="B83232"/>
                 <w:sz w:val="18"/>
               </w:rPr>
               <w:t>David Valdez Romo</w:t>
@@ -1945,12 +1946,13 @@
         <w:tc>
           <w:tcPr>
             <w:tcW w:type="dxa" w:w="1881"/>
-            <w:shd w:val="clear" w:color="auto" w:fill="FFFFFF"/>
+            <w:shd w:val="clear" w:color="auto" w:fill="FDEAEA"/>
           </w:tcPr>
           <w:p>
             <w:r>
               <w:rPr>
                 <w:b w:val="0"/>
+                <w:color w:val="B83232"/>
                 <w:sz w:val="18"/>
               </w:rPr>
               <w:t>Local Fishers</w:t>
@@ -1960,45 +1962,48 @@
         <w:tc>
           <w:tcPr>
             <w:tcW w:type="dxa" w:w="1881"/>
-            <w:shd w:val="clear" w:color="auto" w:fill="FFFFFF"/>
+            <w:shd w:val="clear" w:color="auto" w:fill="FDEAEA"/>
           </w:tcPr>
           <w:p>
             <w:r>
               <w:rPr>
                 <w:b w:val="0"/>
+                <w:color w:val="B83232"/>
                 <w:sz w:val="18"/>
               </w:rPr>
-              <w:t>Indep.</w:t>
+              <w:t>Reembolso hotel</w:t>
             </w:r>
           </w:p>
         </w:tc>
         <w:tc>
           <w:tcPr>
             <w:tcW w:type="dxa" w:w="1881"/>
-            <w:shd w:val="clear" w:color="auto" w:fill="FFFFFF"/>
+            <w:shd w:val="clear" w:color="auto" w:fill="FDEAEA"/>
           </w:tcPr>
           <w:p>
             <w:r>
               <w:rPr>
                 <w:b w:val="0"/>
+                <w:color w:val="B83232"/>
                 <w:sz w:val="18"/>
               </w:rPr>
-              <w:t>Indep.</w:t>
+              <w:t>Reembolso hotel</w:t>
             </w:r>
           </w:p>
         </w:tc>
         <w:tc>
           <w:tcPr>
             <w:tcW w:type="dxa" w:w="1881"/>
-            <w:shd w:val="clear" w:color="auto" w:fill="FFFFFF"/>
+            <w:shd w:val="clear" w:color="auto" w:fill="FDEAEA"/>
           </w:tcPr>
           <w:p>
             <w:r>
               <w:rPr>
                 <w:b w:val="0"/>
+                <w:color w:val="B83232"/>
                 <w:sz w:val="18"/>
               </w:rPr>
-              <w:t>Independizado</w:t>
+              <w:t>DEPENDIENTE — luz y agua</w:t>
             </w:r>
           </w:p>
         </w:tc>
@@ -2009,10 +2014,10 @@
       <w:r>
         <w:rPr>
           <w:b/>
-          <w:color w:val="1D6B4F"/>
+          <w:color w:val="B83232"/>
           <w:sz w:val="21"/>
         </w:rPr>
-        <w:t>FACC  ·  Fiesta Americana Condesa Cancun</w:t>
+        <w:t>FACC  ·  Fiesta Americana Condesa Cancun (acuerdo contractual)</w:t>
       </w:r>
     </w:p>
     <w:tbl>
@@ -2114,12 +2119,13 @@
         <w:tc>
           <w:tcPr>
             <w:tcW w:type="dxa" w:w="1881"/>
-            <w:shd w:val="clear" w:color="auto" w:fill="FFFFFF"/>
+            <w:shd w:val="clear" w:color="auto" w:fill="FDEAEA"/>
           </w:tcPr>
           <w:p>
             <w:r>
               <w:rPr>
                 <w:b w:val="0"/>
+                <w:color w:val="B83232"/>
                 <w:sz w:val="18"/>
               </w:rPr>
               <w:t>Amazon Tours</w:t>
@@ -2129,12 +2135,13 @@
         <w:tc>
           <w:tcPr>
             <w:tcW w:type="dxa" w:w="1881"/>
-            <w:shd w:val="clear" w:color="auto" w:fill="FFFFFF"/>
+            <w:shd w:val="clear" w:color="auto" w:fill="FDEAEA"/>
           </w:tcPr>
           <w:p>
             <w:r>
               <w:rPr>
                 <w:b w:val="0"/>
+                <w:color w:val="B83232"/>
                 <w:sz w:val="18"/>
               </w:rPr>
               <w:t>Local Aqua World</w:t>
@@ -2144,45 +2151,48 @@
         <w:tc>
           <w:tcPr>
             <w:tcW w:type="dxa" w:w="1881"/>
-            <w:shd w:val="clear" w:color="auto" w:fill="FFFFFF"/>
+            <w:shd w:val="clear" w:color="auto" w:fill="FDEAEA"/>
           </w:tcPr>
           <w:p>
             <w:r>
               <w:rPr>
                 <w:b w:val="0"/>
+                <w:color w:val="B83232"/>
                 <w:sz w:val="18"/>
               </w:rPr>
-              <w:t>Indep.</w:t>
+              <w:t>Reembolso hotel</w:t>
             </w:r>
           </w:p>
         </w:tc>
         <w:tc>
           <w:tcPr>
             <w:tcW w:type="dxa" w:w="1881"/>
-            <w:shd w:val="clear" w:color="auto" w:fill="FFFFFF"/>
+            <w:shd w:val="clear" w:color="auto" w:fill="FDEAEA"/>
           </w:tcPr>
           <w:p>
             <w:r>
               <w:rPr>
                 <w:b w:val="0"/>
+                <w:color w:val="B83232"/>
                 <w:sz w:val="18"/>
               </w:rPr>
-              <w:t>Indep.</w:t>
+              <w:t>Reembolso hotel</w:t>
             </w:r>
           </w:p>
         </w:tc>
         <w:tc>
           <w:tcPr>
             <w:tcW w:type="dxa" w:w="1881"/>
-            <w:shd w:val="clear" w:color="auto" w:fill="FFFFFF"/>
+            <w:shd w:val="clear" w:color="auto" w:fill="FDEAEA"/>
           </w:tcPr>
           <w:p>
             <w:r>
               <w:rPr>
                 <w:b w:val="0"/>
+                <w:color w:val="B83232"/>
                 <w:sz w:val="18"/>
               </w:rPr>
-              <w:t>Independizado</w:t>
+              <w:t>DEPENDIENTE — acuerdo contractual</w:t>
             </w:r>
           </w:p>
         </w:tc>
@@ -2191,12 +2201,13 @@
         <w:tc>
           <w:tcPr>
             <w:tcW w:type="dxa" w:w="1881"/>
-            <w:shd w:val="clear" w:color="auto" w:fill="FFFFFF"/>
+            <w:shd w:val="clear" w:color="auto" w:fill="FDEAEA"/>
           </w:tcPr>
           <w:p>
             <w:r>
               <w:rPr>
                 <w:b w:val="0"/>
+                <w:color w:val="B83232"/>
                 <w:sz w:val="18"/>
               </w:rPr>
               <w:t>T.I. Experiencias en Grupos y Convenciones</w:t>
@@ -2206,12 +2217,13 @@
         <w:tc>
           <w:tcPr>
             <w:tcW w:type="dxa" w:w="1881"/>
-            <w:shd w:val="clear" w:color="auto" w:fill="FFFFFF"/>
+            <w:shd w:val="clear" w:color="auto" w:fill="FDEAEA"/>
           </w:tcPr>
           <w:p>
             <w:r>
               <w:rPr>
                 <w:b w:val="0"/>
+                <w:color w:val="B83232"/>
                 <w:sz w:val="18"/>
               </w:rPr>
               <w:t>Local Tropical Elite Travel</w:t>
@@ -2221,45 +2233,48 @@
         <w:tc>
           <w:tcPr>
             <w:tcW w:type="dxa" w:w="1881"/>
-            <w:shd w:val="clear" w:color="auto" w:fill="FFFFFF"/>
+            <w:shd w:val="clear" w:color="auto" w:fill="FDEAEA"/>
           </w:tcPr>
           <w:p>
             <w:r>
               <w:rPr>
                 <w:b w:val="0"/>
+                <w:color w:val="B83232"/>
                 <w:sz w:val="18"/>
               </w:rPr>
-              <w:t>Indep.</w:t>
+              <w:t>Reembolso hotel</w:t>
             </w:r>
           </w:p>
         </w:tc>
         <w:tc>
           <w:tcPr>
             <w:tcW w:type="dxa" w:w="1881"/>
-            <w:shd w:val="clear" w:color="auto" w:fill="FFFFFF"/>
+            <w:shd w:val="clear" w:color="auto" w:fill="FDEAEA"/>
           </w:tcPr>
           <w:p>
             <w:r>
               <w:rPr>
                 <w:b w:val="0"/>
+                <w:color w:val="B83232"/>
                 <w:sz w:val="18"/>
               </w:rPr>
-              <w:t>Indep.</w:t>
+              <w:t>Reembolso hotel</w:t>
             </w:r>
           </w:p>
         </w:tc>
         <w:tc>
           <w:tcPr>
             <w:tcW w:type="dxa" w:w="1881"/>
-            <w:shd w:val="clear" w:color="auto" w:fill="FFFFFF"/>
+            <w:shd w:val="clear" w:color="auto" w:fill="FDEAEA"/>
           </w:tcPr>
           <w:p>
             <w:r>
               <w:rPr>
                 <w:b w:val="0"/>
+                <w:color w:val="B83232"/>
                 <w:sz w:val="18"/>
               </w:rPr>
-              <w:t>Independizado</w:t>
+              <w:t>DEPENDIENTE — acuerdo contractual</w:t>
             </w:r>
           </w:p>
         </w:tc>
@@ -3635,7 +3650,7 @@
       <w:r>
         <w:rPr>
           <w:b/>
-          <w:color w:val="1D6B4F"/>
+          <w:color w:val="B83232"/>
           <w:sz w:val="21"/>
         </w:rPr>
         <w:t>MTYCW  ·  Wyndham Ambassador Monterrey Centro</w:t>
@@ -3740,12 +3755,13 @@
         <w:tc>
           <w:tcPr>
             <w:tcW w:type="dxa" w:w="1881"/>
-            <w:shd w:val="clear" w:color="auto" w:fill="FFFFFF"/>
+            <w:shd w:val="clear" w:color="auto" w:fill="FDEAEA"/>
           </w:tcPr>
           <w:p>
             <w:r>
               <w:rPr>
                 <w:b w:val="0"/>
+                <w:color w:val="B83232"/>
                 <w:sz w:val="18"/>
               </w:rPr>
               <w:t>Alquiladora de Vehículos Automotores</w:t>
@@ -3755,12 +3771,13 @@
         <w:tc>
           <w:tcPr>
             <w:tcW w:type="dxa" w:w="1881"/>
-            <w:shd w:val="clear" w:color="auto" w:fill="FFFFFF"/>
+            <w:shd w:val="clear" w:color="auto" w:fill="FDEAEA"/>
           </w:tcPr>
           <w:p>
             <w:r>
               <w:rPr>
                 <w:b w:val="0"/>
+                <w:color w:val="B83232"/>
                 <w:sz w:val="18"/>
               </w:rPr>
               <w:t>Local Hertz</w:t>
@@ -3770,45 +3787,48 @@
         <w:tc>
           <w:tcPr>
             <w:tcW w:type="dxa" w:w="1881"/>
-            <w:shd w:val="clear" w:color="auto" w:fill="FFFFFF"/>
+            <w:shd w:val="clear" w:color="auto" w:fill="FDEAEA"/>
           </w:tcPr>
           <w:p>
             <w:r>
               <w:rPr>
                 <w:b w:val="0"/>
+                <w:color w:val="B83232"/>
                 <w:sz w:val="18"/>
               </w:rPr>
-              <w:t>Indep.</w:t>
+              <w:t>Reembolso hotel</w:t>
             </w:r>
           </w:p>
         </w:tc>
         <w:tc>
           <w:tcPr>
             <w:tcW w:type="dxa" w:w="1881"/>
-            <w:shd w:val="clear" w:color="auto" w:fill="FFFFFF"/>
+            <w:shd w:val="clear" w:color="auto" w:fill="FDEAEA"/>
           </w:tcPr>
           <w:p>
             <w:r>
               <w:rPr>
                 <w:b w:val="0"/>
+                <w:color w:val="B83232"/>
                 <w:sz w:val="18"/>
               </w:rPr>
-              <w:t>Indep.</w:t>
+              <w:t>Reembolso hotel</w:t>
             </w:r>
           </w:p>
         </w:tc>
         <w:tc>
           <w:tcPr>
             <w:tcW w:type="dxa" w:w="1881"/>
-            <w:shd w:val="clear" w:color="auto" w:fill="FFFFFF"/>
+            <w:shd w:val="clear" w:color="auto" w:fill="FDEAEA"/>
           </w:tcPr>
           <w:p>
             <w:r>
               <w:rPr>
                 <w:b w:val="0"/>
+                <w:color w:val="B83232"/>
                 <w:sz w:val="18"/>
               </w:rPr>
-              <w:t>Independizado</w:t>
+              <w:t>DEPENDIENTE — luz y agua</w:t>
             </w:r>
           </w:p>
         </w:tc>
@@ -3817,12 +3837,13 @@
         <w:tc>
           <w:tcPr>
             <w:tcW w:type="dxa" w:w="1881"/>
-            <w:shd w:val="clear" w:color="auto" w:fill="FFFFFF"/>
+            <w:shd w:val="clear" w:color="auto" w:fill="FDEAEA"/>
           </w:tcPr>
           <w:p>
             <w:r>
               <w:rPr>
                 <w:b w:val="0"/>
+                <w:color w:val="B83232"/>
                 <w:sz w:val="18"/>
               </w:rPr>
               <w:t>Click Mobility</w:t>
@@ -3832,12 +3853,13 @@
         <w:tc>
           <w:tcPr>
             <w:tcW w:type="dxa" w:w="1881"/>
-            <w:shd w:val="clear" w:color="auto" w:fill="FFFFFF"/>
+            <w:shd w:val="clear" w:color="auto" w:fill="FDEAEA"/>
           </w:tcPr>
           <w:p>
             <w:r>
               <w:rPr>
                 <w:b w:val="0"/>
+                <w:color w:val="B83232"/>
                 <w:sz w:val="18"/>
               </w:rPr>
               <w:t>Local Alamo</w:t>
@@ -3847,45 +3869,48 @@
         <w:tc>
           <w:tcPr>
             <w:tcW w:type="dxa" w:w="1881"/>
-            <w:shd w:val="clear" w:color="auto" w:fill="FFFFFF"/>
+            <w:shd w:val="clear" w:color="auto" w:fill="FDEAEA"/>
           </w:tcPr>
           <w:p>
             <w:r>
               <w:rPr>
                 <w:b w:val="0"/>
+                <w:color w:val="B83232"/>
                 <w:sz w:val="18"/>
               </w:rPr>
-              <w:t>Indep.</w:t>
+              <w:t>Reembolso hotel</w:t>
             </w:r>
           </w:p>
         </w:tc>
         <w:tc>
           <w:tcPr>
             <w:tcW w:type="dxa" w:w="1881"/>
-            <w:shd w:val="clear" w:color="auto" w:fill="FFFFFF"/>
+            <w:shd w:val="clear" w:color="auto" w:fill="FDEAEA"/>
           </w:tcPr>
           <w:p>
             <w:r>
               <w:rPr>
                 <w:b w:val="0"/>
+                <w:color w:val="B83232"/>
                 <w:sz w:val="18"/>
               </w:rPr>
-              <w:t>Indep.</w:t>
+              <w:t>Reembolso hotel</w:t>
             </w:r>
           </w:p>
         </w:tc>
         <w:tc>
           <w:tcPr>
             <w:tcW w:type="dxa" w:w="1881"/>
-            <w:shd w:val="clear" w:color="auto" w:fill="FFFFFF"/>
+            <w:shd w:val="clear" w:color="auto" w:fill="FDEAEA"/>
           </w:tcPr>
           <w:p>
             <w:r>
               <w:rPr>
                 <w:b w:val="0"/>
+                <w:color w:val="B83232"/>
                 <w:sz w:val="18"/>
               </w:rPr>
-              <w:t>Independizado</w:t>
+              <w:t>DEPENDIENTE — luz y agua</w:t>
             </w:r>
           </w:p>
         </w:tc>
@@ -3894,12 +3919,13 @@
         <w:tc>
           <w:tcPr>
             <w:tcW w:type="dxa" w:w="1881"/>
-            <w:shd w:val="clear" w:color="auto" w:fill="FFFFFF"/>
+            <w:shd w:val="clear" w:color="auto" w:fill="FDEAEA"/>
           </w:tcPr>
           <w:p>
             <w:r>
               <w:rPr>
                 <w:b w:val="0"/>
+                <w:color w:val="B83232"/>
                 <w:sz w:val="18"/>
               </w:rPr>
               <w:t>Auto Arrendadora y Promotora SA de CV</w:t>
@@ -3909,12 +3935,13 @@
         <w:tc>
           <w:tcPr>
             <w:tcW w:type="dxa" w:w="1881"/>
-            <w:shd w:val="clear" w:color="auto" w:fill="FFFFFF"/>
+            <w:shd w:val="clear" w:color="auto" w:fill="FDEAEA"/>
           </w:tcPr>
           <w:p>
             <w:r>
               <w:rPr>
                 <w:b w:val="0"/>
+                <w:color w:val="B83232"/>
                 <w:sz w:val="18"/>
               </w:rPr>
               <w:t>Local Sixt</w:t>
@@ -3924,45 +3951,48 @@
         <w:tc>
           <w:tcPr>
             <w:tcW w:type="dxa" w:w="1881"/>
-            <w:shd w:val="clear" w:color="auto" w:fill="FFFFFF"/>
+            <w:shd w:val="clear" w:color="auto" w:fill="FDEAEA"/>
           </w:tcPr>
           <w:p>
             <w:r>
               <w:rPr>
                 <w:b w:val="0"/>
+                <w:color w:val="B83232"/>
                 <w:sz w:val="18"/>
               </w:rPr>
-              <w:t>Indep.</w:t>
+              <w:t>Reembolso hotel</w:t>
             </w:r>
           </w:p>
         </w:tc>
         <w:tc>
           <w:tcPr>
             <w:tcW w:type="dxa" w:w="1881"/>
-            <w:shd w:val="clear" w:color="auto" w:fill="FFFFFF"/>
+            <w:shd w:val="clear" w:color="auto" w:fill="FDEAEA"/>
           </w:tcPr>
           <w:p>
             <w:r>
               <w:rPr>
                 <w:b w:val="0"/>
+                <w:color w:val="B83232"/>
                 <w:sz w:val="18"/>
               </w:rPr>
-              <w:t>Indep.</w:t>
+              <w:t>Reembolso hotel</w:t>
             </w:r>
           </w:p>
         </w:tc>
         <w:tc>
           <w:tcPr>
             <w:tcW w:type="dxa" w:w="1881"/>
-            <w:shd w:val="clear" w:color="auto" w:fill="FFFFFF"/>
+            <w:shd w:val="clear" w:color="auto" w:fill="FDEAEA"/>
           </w:tcPr>
           <w:p>
             <w:r>
               <w:rPr>
                 <w:b w:val="0"/>
+                <w:color w:val="B83232"/>
                 <w:sz w:val="18"/>
               </w:rPr>
-              <w:t>Independizado</w:t>
+              <w:t>DEPENDIENTE — luz y agua</w:t>
             </w:r>
           </w:p>
         </w:tc>
@@ -3971,12 +4001,13 @@
         <w:tc>
           <w:tcPr>
             <w:tcW w:type="dxa" w:w="1881"/>
-            <w:shd w:val="clear" w:color="auto" w:fill="FFFFFF"/>
+            <w:shd w:val="clear" w:color="auto" w:fill="FDEAEA"/>
           </w:tcPr>
           <w:p>
             <w:r>
               <w:rPr>
                 <w:b w:val="0"/>
+                <w:color w:val="B83232"/>
                 <w:sz w:val="18"/>
               </w:rPr>
               <w:t>Juan Carlos Alberto Ayala Olvera</w:t>
@@ -3986,12 +4017,13 @@
         <w:tc>
           <w:tcPr>
             <w:tcW w:type="dxa" w:w="1881"/>
-            <w:shd w:val="clear" w:color="auto" w:fill="FFFFFF"/>
+            <w:shd w:val="clear" w:color="auto" w:fill="FDEAEA"/>
           </w:tcPr>
           <w:p>
             <w:r>
               <w:rPr>
                 <w:b w:val="0"/>
+                <w:color w:val="B83232"/>
                 <w:sz w:val="18"/>
               </w:rPr>
               <w:t>Local Oficina</w:t>
@@ -4001,45 +4033,48 @@
         <w:tc>
           <w:tcPr>
             <w:tcW w:type="dxa" w:w="1881"/>
-            <w:shd w:val="clear" w:color="auto" w:fill="FFFFFF"/>
+            <w:shd w:val="clear" w:color="auto" w:fill="FDEAEA"/>
           </w:tcPr>
           <w:p>
             <w:r>
               <w:rPr>
                 <w:b w:val="0"/>
+                <w:color w:val="B83232"/>
                 <w:sz w:val="18"/>
               </w:rPr>
-              <w:t>Indep.</w:t>
+              <w:t>Reembolso hotel</w:t>
             </w:r>
           </w:p>
         </w:tc>
         <w:tc>
           <w:tcPr>
             <w:tcW w:type="dxa" w:w="1881"/>
-            <w:shd w:val="clear" w:color="auto" w:fill="FFFFFF"/>
+            <w:shd w:val="clear" w:color="auto" w:fill="FDEAEA"/>
           </w:tcPr>
           <w:p>
             <w:r>
               <w:rPr>
                 <w:b w:val="0"/>
+                <w:color w:val="B83232"/>
                 <w:sz w:val="18"/>
               </w:rPr>
-              <w:t>Indep.</w:t>
+              <w:t>Reembolso hotel</w:t>
             </w:r>
           </w:p>
         </w:tc>
         <w:tc>
           <w:tcPr>
             <w:tcW w:type="dxa" w:w="1881"/>
-            <w:shd w:val="clear" w:color="auto" w:fill="FFFFFF"/>
+            <w:shd w:val="clear" w:color="auto" w:fill="FDEAEA"/>
           </w:tcPr>
           <w:p>
             <w:r>
               <w:rPr>
                 <w:b w:val="0"/>
+                <w:color w:val="B83232"/>
                 <w:sz w:val="18"/>
               </w:rPr>
-              <w:t>Independizado</w:t>
+              <w:t>DEPENDIENTE — luz y agua</w:t>
             </w:r>
           </w:p>
         </w:tc>
@@ -4048,12 +4083,13 @@
         <w:tc>
           <w:tcPr>
             <w:tcW w:type="dxa" w:w="1881"/>
-            <w:shd w:val="clear" w:color="auto" w:fill="FFFFFF"/>
+            <w:shd w:val="clear" w:color="auto" w:fill="FDEAEA"/>
           </w:tcPr>
           <w:p>
             <w:r>
               <w:rPr>
                 <w:b w:val="0"/>
+                <w:color w:val="B83232"/>
                 <w:sz w:val="18"/>
               </w:rPr>
               <w:t>Corporativo Empresarial Solar</w:t>
@@ -4063,12 +4099,13 @@
         <w:tc>
           <w:tcPr>
             <w:tcW w:type="dxa" w:w="1881"/>
-            <w:shd w:val="clear" w:color="auto" w:fill="FFFFFF"/>
+            <w:shd w:val="clear" w:color="auto" w:fill="FDEAEA"/>
           </w:tcPr>
           <w:p>
             <w:r>
               <w:rPr>
                 <w:b w:val="0"/>
+                <w:color w:val="B83232"/>
                 <w:sz w:val="18"/>
               </w:rPr>
               <w:t>Local Corporativo</w:t>
@@ -4078,45 +4115,48 @@
         <w:tc>
           <w:tcPr>
             <w:tcW w:type="dxa" w:w="1881"/>
-            <w:shd w:val="clear" w:color="auto" w:fill="FFFFFF"/>
+            <w:shd w:val="clear" w:color="auto" w:fill="FDEAEA"/>
           </w:tcPr>
           <w:p>
             <w:r>
               <w:rPr>
                 <w:b w:val="0"/>
+                <w:color w:val="B83232"/>
                 <w:sz w:val="18"/>
               </w:rPr>
-              <w:t>Indep.</w:t>
+              <w:t>Reembolso hotel</w:t>
             </w:r>
           </w:p>
         </w:tc>
         <w:tc>
           <w:tcPr>
             <w:tcW w:type="dxa" w:w="1881"/>
-            <w:shd w:val="clear" w:color="auto" w:fill="FFFFFF"/>
+            <w:shd w:val="clear" w:color="auto" w:fill="FDEAEA"/>
           </w:tcPr>
           <w:p>
             <w:r>
               <w:rPr>
                 <w:b w:val="0"/>
+                <w:color w:val="B83232"/>
                 <w:sz w:val="18"/>
               </w:rPr>
-              <w:t>Indep.</w:t>
+              <w:t>Reembolso hotel</w:t>
             </w:r>
           </w:p>
         </w:tc>
         <w:tc>
           <w:tcPr>
             <w:tcW w:type="dxa" w:w="1881"/>
-            <w:shd w:val="clear" w:color="auto" w:fill="FFFFFF"/>
+            <w:shd w:val="clear" w:color="auto" w:fill="FDEAEA"/>
           </w:tcPr>
           <w:p>
             <w:r>
               <w:rPr>
                 <w:b w:val="0"/>
+                <w:color w:val="B83232"/>
                 <w:sz w:val="18"/>
               </w:rPr>
-              <w:t>Independizado</w:t>
+              <w:t>DEPENDIENTE — luz y agua</w:t>
             </w:r>
           </w:p>
         </w:tc>
@@ -4125,12 +4165,13 @@
         <w:tc>
           <w:tcPr>
             <w:tcW w:type="dxa" w:w="1881"/>
-            <w:shd w:val="clear" w:color="auto" w:fill="FFFFFF"/>
+            <w:shd w:val="clear" w:color="auto" w:fill="FDEAEA"/>
           </w:tcPr>
           <w:p>
             <w:r>
               <w:rPr>
                 <w:b w:val="0"/>
+                <w:color w:val="B83232"/>
                 <w:sz w:val="18"/>
               </w:rPr>
               <w:t>Gestoria Administrativa Profesional</w:t>
@@ -4140,12 +4181,13 @@
         <w:tc>
           <w:tcPr>
             <w:tcW w:type="dxa" w:w="1881"/>
-            <w:shd w:val="clear" w:color="auto" w:fill="FFFFFF"/>
+            <w:shd w:val="clear" w:color="auto" w:fill="FDEAEA"/>
           </w:tcPr>
           <w:p>
             <w:r>
               <w:rPr>
                 <w:b w:val="0"/>
+                <w:color w:val="B83232"/>
                 <w:sz w:val="18"/>
               </w:rPr>
               <w:t>Local Gestoria</w:t>
@@ -4155,45 +4197,48 @@
         <w:tc>
           <w:tcPr>
             <w:tcW w:type="dxa" w:w="1881"/>
-            <w:shd w:val="clear" w:color="auto" w:fill="FFFFFF"/>
+            <w:shd w:val="clear" w:color="auto" w:fill="FDEAEA"/>
           </w:tcPr>
           <w:p>
             <w:r>
               <w:rPr>
                 <w:b w:val="0"/>
+                <w:color w:val="B83232"/>
                 <w:sz w:val="18"/>
               </w:rPr>
-              <w:t>Indep.</w:t>
+              <w:t>Reembolso hotel</w:t>
             </w:r>
           </w:p>
         </w:tc>
         <w:tc>
           <w:tcPr>
             <w:tcW w:type="dxa" w:w="1881"/>
-            <w:shd w:val="clear" w:color="auto" w:fill="FFFFFF"/>
+            <w:shd w:val="clear" w:color="auto" w:fill="FDEAEA"/>
           </w:tcPr>
           <w:p>
             <w:r>
               <w:rPr>
                 <w:b w:val="0"/>
+                <w:color w:val="B83232"/>
                 <w:sz w:val="18"/>
               </w:rPr>
-              <w:t>Indep.</w:t>
+              <w:t>Reembolso hotel</w:t>
             </w:r>
           </w:p>
         </w:tc>
         <w:tc>
           <w:tcPr>
             <w:tcW w:type="dxa" w:w="1881"/>
-            <w:shd w:val="clear" w:color="auto" w:fill="FFFFFF"/>
+            <w:shd w:val="clear" w:color="auto" w:fill="FDEAEA"/>
           </w:tcPr>
           <w:p>
             <w:r>
               <w:rPr>
                 <w:b w:val="0"/>
+                <w:color w:val="B83232"/>
                 <w:sz w:val="18"/>
               </w:rPr>
-              <w:t>Independizado</w:t>
+              <w:t>DEPENDIENTE — luz y agua</w:t>
             </w:r>
           </w:p>
         </w:tc>
@@ -5622,7 +5667,7 @@
                 <w:b w:val="0"/>
                 <w:sz w:val="19"/>
               </w:rPr>
-              <w:t>5</w:t>
+              <w:t>14</w:t>
             </w:r>
           </w:p>
         </w:tc>
@@ -5637,7 +5682,7 @@
                 <w:b w:val="0"/>
                 <w:sz w:val="19"/>
               </w:rPr>
-              <w:t>1</w:t>
+              <w:t>0</w:t>
             </w:r>
           </w:p>
         </w:tc>
@@ -5652,7 +5697,7 @@
                 <w:b w:val="0"/>
                 <w:sz w:val="19"/>
               </w:rPr>
-              <w:t>20%</w:t>
+              <w:t>0%</w:t>
             </w:r>
           </w:p>
         </w:tc>
@@ -5667,7 +5712,7 @@
                 <w:b w:val="0"/>
                 <w:sz w:val="19"/>
               </w:rPr>
-              <w:t>4 (Tijuana x3, Hermosillo)</w:t>
+              <w:t>14 (Tijuana x3, Hermosillo, Aguascalientes, Cancun x2*, Wyndham x6)</w:t>
             </w:r>
           </w:p>
         </w:tc>
@@ -5682,7 +5727,7 @@
                 <w:b w:val="0"/>
                 <w:sz w:val="19"/>
               </w:rPr>
-              <w:t>80%</w:t>
+              <w:t>100%</w:t>
             </w:r>
           </w:p>
         </w:tc>
@@ -5946,7 +5991,7 @@
                 <w:b w:val="0"/>
                 <w:sz w:val="19"/>
               </w:rPr>
-              <w:t>22</w:t>
+              <w:t>13</w:t>
             </w:r>
           </w:p>
         </w:tc>
@@ -5961,7 +6006,7 @@
                 <w:b w:val="0"/>
                 <w:sz w:val="19"/>
               </w:rPr>
-              <w:t>22</w:t>
+              <w:t>13</w:t>
             </w:r>
           </w:p>
         </w:tc>

</xml_diff>